<commit_message>
[Mahi Sharma] Add. address book sonarQube report.
</commit_message>
<xml_diff>
--- a/design-pattern-practice/gcr-codebase/SonarQube-Integration-Project-Submission.docx
+++ b/design-pattern-practice/gcr-codebase/SonarQube-Integration-Project-Submission.docx
@@ -392,8 +392,8 @@
         </w:rPr>
         <w:drawing>
           <wp:inline distT="0" distB="0" distL="0" distR="0">
-            <wp:extent cx="6480810" cy="3764280"/>
-            <wp:effectExtent l="0" t="0" r="0" b="7620"/>
+            <wp:extent cx="6480810" cy="3643676"/>
+            <wp:effectExtent l="19050" t="0" r="0" b="0"/>
             <wp:docPr id="409879908" name="Picture 1"/>
             <wp:cNvGraphicFramePr>
               <a:graphicFrameLocks xmlns:a="http://schemas.openxmlformats.org/drawingml/2006/main" noChangeAspect="1"/>
@@ -414,7 +414,7 @@
                   <pic:spPr>
                     <a:xfrm>
                       <a:off x="0" y="0"/>
-                      <a:ext cx="6480810" cy="3764280"/>
+                      <a:ext cx="6480810" cy="3643676"/>
                     </a:xfrm>
                     <a:prstGeom prst="rect">
                       <a:avLst/>
@@ -582,8 +582,8 @@
         <w:lastRenderedPageBreak/>
         <w:drawing>
           <wp:inline distT="0" distB="0" distL="0" distR="0">
-            <wp:extent cx="6480810" cy="2782570"/>
-            <wp:effectExtent l="0" t="0" r="0" b="0"/>
+            <wp:extent cx="6357366" cy="2670048"/>
+            <wp:effectExtent l="19050" t="0" r="5334" b="0"/>
             <wp:docPr id="1779882711" name="Picture 1"/>
             <wp:cNvGraphicFramePr>
               <a:graphicFrameLocks xmlns:a="http://schemas.openxmlformats.org/drawingml/2006/main" noChangeAspect="1"/>
@@ -597,6 +597,7 @@
                   </pic:nvPicPr>
                   <pic:blipFill>
                     <a:blip r:embed="rId6"/>
+                    <a:srcRect t="3947"/>
                     <a:stretch>
                       <a:fillRect/>
                     </a:stretch>
@@ -604,7 +605,7 @@
                   <pic:spPr>
                     <a:xfrm>
                       <a:off x="0" y="0"/>
-                      <a:ext cx="6480810" cy="2782570"/>
+                      <a:ext cx="6357366" cy="2670048"/>
                     </a:xfrm>
                     <a:prstGeom prst="rect">
                       <a:avLst/>
@@ -648,8 +649,8 @@
         </w:rPr>
         <w:drawing>
           <wp:inline distT="0" distB="0" distL="0" distR="0">
-            <wp:extent cx="6480810" cy="2771140"/>
-            <wp:effectExtent l="0" t="0" r="0" b="0"/>
+            <wp:extent cx="6352286" cy="2632114"/>
+            <wp:effectExtent l="19050" t="0" r="0" b="0"/>
             <wp:docPr id="1401291136" name="Picture 1"/>
             <wp:cNvGraphicFramePr>
               <a:graphicFrameLocks xmlns:a="http://schemas.openxmlformats.org/drawingml/2006/main" noChangeAspect="1"/>
@@ -663,6 +664,7 @@
                   </pic:nvPicPr>
                   <pic:blipFill>
                     <a:blip r:embed="rId7"/>
+                    <a:srcRect t="4846"/>
                     <a:stretch>
                       <a:fillRect/>
                     </a:stretch>
@@ -670,7 +672,7 @@
                   <pic:spPr>
                     <a:xfrm>
                       <a:off x="0" y="0"/>
-                      <a:ext cx="6480810" cy="2771140"/>
+                      <a:ext cx="6355563" cy="2633472"/>
                     </a:xfrm>
                     <a:prstGeom prst="rect">
                       <a:avLst/>
@@ -869,8 +871,8 @@
         <w:lastRenderedPageBreak/>
         <w:drawing>
           <wp:inline distT="0" distB="0" distL="0" distR="0">
-            <wp:extent cx="6480810" cy="3645535"/>
-            <wp:effectExtent l="0" t="0" r="0" b="0"/>
+            <wp:extent cx="6480810" cy="3643676"/>
+            <wp:effectExtent l="19050" t="0" r="0" b="0"/>
             <wp:docPr id="229480112" name="Picture 1"/>
             <wp:cNvGraphicFramePr>
               <a:graphicFrameLocks xmlns:a="http://schemas.openxmlformats.org/drawingml/2006/main" noChangeAspect="1"/>
@@ -891,7 +893,7 @@
                   <pic:spPr>
                     <a:xfrm>
                       <a:off x="0" y="0"/>
-                      <a:ext cx="6480810" cy="3645535"/>
+                      <a:ext cx="6480810" cy="3643676"/>
                     </a:xfrm>
                     <a:prstGeom prst="rect">
                       <a:avLst/>
@@ -1754,7 +1756,17 @@
                       <w:sz w:val="24"/>
                       <w:szCs w:val="24"/>
                     </w:rPr>
-                    <w:t>sonar-scanner.bat -</w:t>
+                    <w:t>sonar-s</w:t>
+                  </w:r>
+                  <w:r>
+                    <w:rPr>
+                      <w:rFonts w:ascii="Times New Roman" w:hAnsi="Times New Roman" w:cs="Times New Roman"/>
+                      <w:b/>
+                      <w:bCs/>
+                      <w:sz w:val="24"/>
+                      <w:szCs w:val="24"/>
+                    </w:rPr>
+                    <w:t>canner.bat -</w:t>
                   </w:r>
                   <w:proofErr w:type="spellStart"/>
                   <w:r>
@@ -1776,7 +1788,17 @@
                       <w:sz w:val="24"/>
                       <w:szCs w:val="24"/>
                     </w:rPr>
-                    <w:t>=address-book" -</w:t>
+                    <w:t>=Address-B</w:t>
+                  </w:r>
+                  <w:r>
+                    <w:rPr>
+                      <w:rFonts w:ascii="Times New Roman" w:hAnsi="Times New Roman" w:cs="Times New Roman"/>
+                      <w:b/>
+                      <w:bCs/>
+                      <w:sz w:val="24"/>
+                      <w:szCs w:val="24"/>
+                    </w:rPr>
+                    <w:t>ook" -</w:t>
                   </w:r>
                   <w:proofErr w:type="spellStart"/>
                   <w:r>
@@ -6121,7 +6143,7 @@
   <a:extraClrSchemeLst/>
   <a:extLst>
     <a:ext uri="{05A4C25C-085E-4340-85A3-A5531E510DB2}">
-      <thm15:themeFamily xmlns:thm15="http://schemas.microsoft.com/office/thememl/2012/main" xmlns="" name="Office Theme" id="{62F939B6-93AF-4DB8-9C6B-D6C7DFDC589F}" vid="{4A3C46E8-61CC-4603-A589-7422A47A8E4A}"/>
+      <thm15:themeFamily xmlns="" xmlns:thm15="http://schemas.microsoft.com/office/thememl/2012/main" name="Office Theme" id="{62F939B6-93AF-4DB8-9C6B-D6C7DFDC589F}" vid="{4A3C46E8-61CC-4603-A589-7422A47A8E4A}"/>
     </a:ext>
   </a:extLst>
 </a:theme>

</xml_diff>